<commit_message>
Add canonical simulation results data pipeline, physics reference benchmarks, and regression tests
</commit_message>
<xml_diff>
--- a/AUV_Adaptive_Sonar_Complete_Results_and_Output_Interpretation_Report.docx
+++ b/AUV_Adaptive_Sonar_Complete_Results_and_Output_Interpretation_Report.docx
@@ -26932,7 +26932,7 @@
           <w:color w:val="222222"/>
           <w:sz w:val="20"/>
         </w:rPr>
-        <w:t>The integrity of the digital twin codebase is enforced by a comprehensive automated unit test suite consisting of 56 distinct tests across Python and MATLAB. Executed via `pytest` (passing in 1.87 seconds with zero failures), the tests are organized into five functional verification groups. Rather than presenting a superficial pass-count, each group is analyzed below in terms of failure scenarios, proof scope, and inherent limitations.</w:t>
+        <w:t>The integrity of the digital twin codebase is enforced by a comprehensive automated test suite consisting of 64 distinct Python unit and regression tests plus 35 MATLAB validation checks (99 total across suites). Executed via `pytest` (passing in 1.99 seconds with zero failures), the Python tests are organized into six functional verification groups. Rather than presenting a superficial pass-count, each group is analyzed below in terms of failure scenarios, proof scope, and inherent limitations.</w:t>
       </w:r>
     </w:p>
     <w:p>
@@ -27399,7 +27399,7 @@
           <w:color w:val="222222"/>
           <w:sz w:val="20"/>
         </w:rPr>
-        <w:t>Proves 100% parameter, formula, and architectural parity between Python and MATLAB implementations; validates that exported C headers compile with valid syntax and macros; and proves bit-exact round-trip fidelity (8,000 / 8,000 samples matched with 0 LSB error).</w:t>
+        <w:t>Proves parameter, formula, and architectural parity between Python and MATLAB implementations; validates that exported C headers compile with valid syntax and macros; and proves round-trip fidelity (8,000 / 8,000 samples matched with 0 LSB error).</w:t>
       </w:r>
     </w:p>
     <w:p>
@@ -27423,6 +27423,104 @@
           <w:sz w:val="20"/>
         </w:rPr>
         <w:t>Does not prove that an external STM32 toolchain (Keil, STM32CubeIDE, GCC) will compile without linker script adjustments or hardware memory layout conflicts.</w:t>
+      </w:r>
+    </w:p>
+    <w:p>
+      <w:pPr>
+        <w:pStyle w:val="Heading2"/>
+        <w:keepNext/>
+        <w:spacing w:before="280" w:after="120"/>
+      </w:pPr>
+      <w:r>
+        <w:rPr>
+          <w:rFonts w:ascii="Calibri" w:hAnsi="Calibri"/>
+          <w:b/>
+          <w:color w:val="2B5B84"/>
+          <w:sz w:val="26"/>
+        </w:rPr>
+        <w:t>13.6 Group 6 — Physics Regression &amp; Independent Reference Parity Tests (8 Tests)</w:t>
+      </w:r>
+    </w:p>
+    <w:p>
+      <w:pPr>
+        <w:spacing w:before="0" w:after="120" w:line="276" w:lineRule="auto"/>
+      </w:pPr>
+      <w:r>
+        <w:rPr>
+          <w:rFonts w:ascii="Calibri" w:hAnsi="Calibri"/>
+          <w:color w:val="222222"/>
+          <w:sz w:val="20"/>
+        </w:rPr>
+        <w:t>Includes `test_frequency_unit_scaling_hz_vs_khz`, `test_attenuation_unit_scaling_db_km_vs_db_m`, `test_independent_reference_parity_within_tolerance`, `test_canonical_profile_mean_values`, `test_attenuation_strictly_monotonic_with_frequency`, `test_profile_viability_ranges_and_margins`, `test_low_frequency_operability_at_200m_and_extinction_boundary`, and `test_canonical_results_json_schema_and_content`.</w:t>
+      </w:r>
+    </w:p>
+    <w:p>
+      <w:pPr>
+        <w:pStyle w:val="ListBullet"/>
+        <w:spacing w:before="0" w:after="60" w:line="276" w:lineRule="auto"/>
+      </w:pPr>
+      <w:r>
+        <w:rPr>
+          <w:rFonts w:ascii="Calibri" w:hAnsi="Calibri"/>
+          <w:b/>
+          <w:color w:val="1B365D"/>
+          <w:sz w:val="20"/>
+        </w:rPr>
+        <w:t xml:space="preserve">Failure Scenario: </w:t>
+      </w:r>
+      <w:r>
+        <w:rPr>
+          <w:rFonts w:ascii="Calibri" w:hAnsi="Calibri"/>
+          <w:color w:val="222222"/>
+          <w:sz w:val="20"/>
+        </w:rPr>
+        <w:t>Frequency unit mismatch (e.g. kHz passed into Hz equation or vice-versa), dB/km vs dB/m dimensional scaling errors, divergence between production physics and an independently formulated reference implementation (&gt; 1.0% tolerance), non-monotonic attenuation curves, or drift in canonical profile attenuation values and operational viability boundaries.</w:t>
+      </w:r>
+    </w:p>
+    <w:p>
+      <w:pPr>
+        <w:pStyle w:val="ListBullet"/>
+        <w:spacing w:before="0" w:after="60" w:line="276" w:lineRule="auto"/>
+      </w:pPr>
+      <w:r>
+        <w:rPr>
+          <w:rFonts w:ascii="Calibri" w:hAnsi="Calibri"/>
+          <w:b/>
+          <w:color w:val="1B365D"/>
+          <w:sz w:val="20"/>
+        </w:rPr>
+        <w:t xml:space="preserve">What a Passing Result Proves: </w:t>
+      </w:r>
+      <w:r>
+        <w:rPr>
+          <w:rFonts w:ascii="Calibri" w:hAnsi="Calibri"/>
+          <w:color w:val="222222"/>
+          <w:sz w:val="20"/>
+        </w:rPr>
+        <w:t>Proves that the production Ainslie-McColm absorption implementation rigorously matches an independent reference implementation to within 0.8% (well inside the 1.0% limit); confirms dimensional consistency (dB/km / 1000 = dB/m); validates that LOW_FREQUENCY remains viable at 200 m (-58.91 dB margin, +6.09 dB headroom) with theoretical extinction at 259.4 m; and verifies that the canonical results artifact outputs/canonical_profile_results.json is structurally intact and fully synchronized.</w:t>
+      </w:r>
+    </w:p>
+    <w:p>
+      <w:pPr>
+        <w:pStyle w:val="ListBullet"/>
+        <w:spacing w:before="0" w:after="60" w:line="276" w:lineRule="auto"/>
+      </w:pPr>
+      <w:r>
+        <w:rPr>
+          <w:rFonts w:ascii="Calibri" w:hAnsi="Calibri"/>
+          <w:b/>
+          <w:color w:val="1B365D"/>
+          <w:sz w:val="20"/>
+        </w:rPr>
+        <w:t xml:space="preserve">What a Passing Result Does NOT Prove: </w:t>
+      </w:r>
+      <w:r>
+        <w:rPr>
+          <w:rFonts w:ascii="Calibri" w:hAnsi="Calibri"/>
+          <w:color w:val="222222"/>
+          <w:sz w:val="20"/>
+        </w:rPr>
+        <w:t>Does not prove that empirical ocean field measurements will match Ainslie-McColm theoretical predictions under non-standard salinity anomalies or severe sediment suspension.</w:t>
       </w:r>
     </w:p>
     <w:tbl>
@@ -27482,15 +27580,19 @@
                 <w:color w:val="222222"/>
                 <w:sz w:val="19"/>
               </w:rPr>
-              <w:t>Total Automated Unit Tests: 56</w:t>
+              <w:t>Total Automated Tests: 99 validation checks across suites</w:t>
               <w:br/>
-              <w:t>Tests Passed: 56 (100.0%)</w:t>
+              <w:t xml:space="preserve">  • Python Suite: 64 passed, 0 failed (56 baseline + 8 physics regression tests)</w:t>
               <w:br/>
-              <w:t>Tests Failed: 0</w:t>
+              <w:t xml:space="preserve">  • MATLAB DSP Validation Suite: 23 passed, 0 failed</w:t>
               <w:br/>
-              <w:t>Execution Runtime: 1.87 seconds</w:t>
+              <w:t xml:space="preserve">  • MATLAB Priority-1 Feature Suite: 12 passed, 0 failed</w:t>
               <w:br/>
-              <w:t>Test Harnesses: pytest (Python 3.13), unittest, and MATLAB run_validation_suite.m (23 tests).</w:t>
+              <w:t>Overall Execution Status: 100% passing across all platforms</w:t>
+              <w:br/>
+              <w:t>Python Execution Runtime: 1.99 seconds via pytest</w:t>
+              <w:br/>
+              <w:t>Independent Physics Parity: Verified within 0.8% error (&lt; 1.0% tolerance).</w:t>
             </w:r>
           </w:p>
         </w:tc>

</xml_diff>

<commit_message>
Correct hydrostatic depth attenuation P2 in Ainslie-McColm model, achieve machine-precision parity, and update reports
</commit_message>
<xml_diff>
--- a/AUV_Adaptive_Sonar_Complete_Results_and_Output_Interpretation_Report.docx
+++ b/AUV_Adaptive_Sonar_Complete_Results_and_Output_Interpretation_Report.docx
@@ -27438,7 +27438,7 @@
           <w:color w:val="2B5B84"/>
           <w:sz w:val="26"/>
         </w:rPr>
-        <w:t>13.6 Group 6 — Physics Regression &amp; Independent Reference Parity Tests (8 Tests)</w:t>
+        <w:t>13.6 Group 6 — Physics Regression &amp; Hydrostatic Parity Tests (9 Tests)</w:t>
       </w:r>
     </w:p>
     <w:p>
@@ -27451,7 +27451,7 @@
           <w:color w:val="222222"/>
           <w:sz w:val="20"/>
         </w:rPr>
-        <w:t>Includes `test_frequency_unit_scaling_hz_vs_khz`, `test_attenuation_unit_scaling_db_km_vs_db_m`, `test_independent_reference_parity_within_tolerance`, `test_canonical_profile_mean_values`, `test_attenuation_strictly_monotonic_with_frequency`, `test_profile_viability_ranges_and_margins`, `test_low_frequency_operability_at_200m_and_extinction_boundary`, and `test_canonical_results_json_schema_and_content`.</w:t>
+        <w:t>Includes `test_01_frequency_unit_conversion_correctness`, `test_02_distance_and_attenuation_units`, `test_03_implementation_parity_matrix` (Validation A: machine precision across 10m-300m depth envelope), `test_04_p2_hydrostatic_depth_regression` (Validation B: P2 = exp(-D/6000) analytical and monotonicity protection), `test_05_canonical_profile_mean_attenuation`, `test_06_profile_ordering_sanity`, `test_07_viability_boundaries`, `test_08_environmental_speed_of_sound_consistency`, and `test_09_canonical_json_artifact_integrity`.</w:t>
       </w:r>
     </w:p>
     <w:p>
@@ -27474,7 +27474,7 @@
           <w:color w:val="222222"/>
           <w:sz w:val="20"/>
         </w:rPr>
-        <w:t>Frequency unit mismatch (e.g. kHz passed into Hz equation or vice-versa), dB/km vs dB/m dimensional scaling errors, divergence between production physics and an independently formulated reference implementation (&gt; 1.0% tolerance), non-monotonic attenuation curves, or drift in canonical profile attenuation values and operational viability boundaries.</w:t>
+        <w:t>Frequency unit mismatch (e.g. kHz passed into Hz equation or vice-versa), dB/km vs dB/m dimensional scaling errors, omission of P2 hydrostatic depth factor on MgSO4, divergence between production physics and an independently formulated reference implementation (&gt; 1e-10 relative error), non-monotonic attenuation curves, or drift in canonical profile attenuation values and operational viability boundaries.</w:t>
       </w:r>
     </w:p>
     <w:p>
@@ -27497,7 +27497,7 @@
           <w:color w:val="222222"/>
           <w:sz w:val="20"/>
         </w:rPr>
-        <w:t>Proves that the production Ainslie-McColm absorption implementation rigorously matches an independent reference implementation to within 0.8% (well inside the 1.0% limit); confirms dimensional consistency (dB/km / 1000 = dB/m); validates that LOW_FREQUENCY remains viable at 200 m (-58.91 dB margin, +6.09 dB headroom) with theoretical extinction at 259.4 m; and verifies that the canonical results artifact outputs/canonical_profile_results.json is structurally intact and fully synchronized.</w:t>
+        <w:t>Proves that the production Ainslie-McColm absorption implementation rigorously matches an independent reference implementation to numerical precision (&lt; 1e-10 relative error) across the validated 10m to 300m depth operating matrix; confirms P2 = exp(-D/6000) hydrostatic pressure correction on MgSO4; confirms dimensional consistency (dB/km / 1000 = dB/m); validates that LOW_FREQUENCY remains viable at 200 m (-58.82 dB margin, +6.18 dB headroom) with theoretical extinction at 260.7 m; and verifies that the canonical results artifact outputs/canonical_profile_results.json is structurally intact and fully synchronized.</w:t>
       </w:r>
     </w:p>
     <w:p>
@@ -27580,9 +27580,9 @@
                 <w:color w:val="222222"/>
                 <w:sz w:val="19"/>
               </w:rPr>
-              <w:t>Total Automated Tests: 99 validation checks across suites</w:t>
+              <w:t>Total Automated Tests: 101 validation checks across suites</w:t>
               <w:br/>
-              <w:t xml:space="preserve">  • Python Suite: 64 passed, 0 failed (56 baseline + 8 physics regression tests)</w:t>
+              <w:t xml:space="preserve">  • Python Suite: 66 passed, 0 failed (56 baseline + 9 physics regression + 1 MATLAB P2 parity test)</w:t>
               <w:br/>
               <w:t xml:space="preserve">  • MATLAB DSP Validation Suite: 23 passed, 0 failed</w:t>
               <w:br/>
@@ -27590,9 +27590,9 @@
               <w:br/>
               <w:t>Overall Execution Status: 100% passing across all platforms</w:t>
               <w:br/>
-              <w:t>Python Execution Runtime: 1.99 seconds via pytest</w:t>
+              <w:t>Python Execution Runtime: ~1.5 seconds via unittest / pytest</w:t>
               <w:br/>
-              <w:t>Independent Physics Parity: Verified within 0.8% error (&lt; 1.0% tolerance).</w:t>
+              <w:t>Independent Physics Parity: Verified to machine precision (&lt; 1e-10 relative error across 10m–300m depth envelope).</w:t>
             </w:r>
           </w:p>
         </w:tc>
@@ -27849,11 +27849,11 @@
                 <w:color w:val="222222"/>
                 <w:sz w:val="18"/>
               </w:rPr>
-              <w:t>LOW: 64.5 dB/km</w:t>
+              <w:t>LOW: 64.0 dB/km</w:t>
               <w:br/>
-              <w:t>BAL: 106.3 dB/km</w:t>
+              <w:t>BAL: 105.6 dB/km</w:t>
               <w:br/>
-              <w:t>HIGH: 136.6 dB/km</w:t>
+              <w:t>HIGH: 135.9 dB/km</w:t>
             </w:r>
           </w:p>
         </w:tc>

</xml_diff>